<commit_message>
Riscrive il dossier Siher come indagine editoriale
</commit_message>
<xml_diff>
--- a/DOSSIER_SIHER_LA_CAUTELA_ESCLUSA.docx
+++ b/DOSSIER_SIHER_LA_CAUTELA_ESCLUSA.docx
@@ -97,7 +97,7 @@
           <w:color w:val="000000"/>
           <w:sz w:val="25"/>
         </w:rPr>
-        <w:t>La scarcerazione decisa dalla gip Tiziana Landoni, il materiale digitale ancora da esaminare e le minacce emerse nelle chat del Movimento 17 ottobre</w:t>
+        <w:t>Perché liberare senza alcuna misura Youssef Siher prima di completare gli accertamenti digitali è stata una scelta di rischio e non un esito inevitabile</w:t>
       </w:r>
     </w:p>
     <w:p>
@@ -111,7 +111,7 @@
           <w:color w:val="444444"/>
           <w:sz w:val="17"/>
         </w:rPr>
-        <w:t>DOSSIER  |  Chiusura redazionale 31 ottobre 2026  |  Tempo di lettura 18 minuti</w:t>
+        <w:t>DOSSIER  |  Chiusura redazionale 31 ottobre 2026  |  Tempo di lettura 20 minuti</w:t>
       </w:r>
     </w:p>
     <w:p>
@@ -144,7 +144,7 @@
           <w:color w:val="000000"/>
           <w:sz w:val="26"/>
         </w:rPr>
-        <w:t>La decisione della giudice per le indagini preliminari Tiziana Landoni ha escluso ogni forma di cautela nei confronti di Youssef Siher. Il punto non è pretendere una condanna anticipata. È capire se fosse ragionevole liberarlo senza alcuna misura mentre gli accertamenti digitali non erano conclusi e mancavano due giorni a una nuova manifestazione nazionale.</w:t>
+        <w:t>Il 28 ottobre 2026 la giudice per le indagini preliminari Tiziana Landoni non ha soltanto respinto il carcere per Youssef Siher. Ha scelto di non applicare alcuna cautela, mentre gli investigatori stavano ancora entrando nel materiale digitale e mancavano due giorni a una nuova mobilitazione nazionale. Quel vuoto di protezione è il fatto politico e giudiziario che merita di essere esaminato.</w:t>
       </w:r>
     </w:p>
     <w:p>
@@ -157,7 +157,7 @@
           <w:color w:val="000000"/>
           <w:sz w:val="22"/>
         </w:rPr>
-        <w:t>Il 28 ottobre 2026 la giudice per le indagini preliminari (GIP) di Milano non ha convalidato il fermo disposto dalla Procura e ha respinto la richiesta di custodia cautelare in carcere. Siher è tornato libero. La decisione non ha chiuso l’indagine e non equivale a un’assoluzione, ma ha prodotto un effetto immediato: nessun vincolo personale, proprio nella fase in cui telefono e computer potevano ancora restituire elementi nuovi.</w:t>
+        <w:t>Il fermo non è una condanna. La libertà personale non può essere compressa per offrire alla Procura qualche giorno di lavoro in più. Ma da questi principi non discende che l’unica alternativa alla custodia in carcere fosse restituire a Siher piena libertà senza condizioni. Il Codice di procedura penale prevede misure graduate e revocabili. Landoni le ha escluse tutte perché ha letto i messaggi attribuiti all’indagato come espressione politica priva di un richiamo diretto alla violenza e ha giudicato insussistenti le esigenze cautelari.</w:t>
       </w:r>
     </w:p>
     <w:p>
@@ -170,7 +170,7 @@
           <w:color w:val="000000"/>
           <w:sz w:val="22"/>
         </w:rPr>
-        <w:t>Landoni non ha definito la vicenda una bravata. Tuttavia, leggendo i contenuti direttamente attribuiti a Siher come disobbedienza civile e libera espressione, e negando ogni misura, il provvedimento ha adottato l’interpretazione meno allarmante del rischio prima che il quadro digitale fosse completo. È questa scelta, non l’indipendenza della magistrata né la legittimità del controllo giudiziario sul fermo, il centro dell’indagine.</w:t>
+        <w:t>La nostra tesi è diversa. Il rischio non si misurava soltanto cercando una frase firmata da Siher con un ordine esplicito di colpire qualcuno. Si misurava anche nel ruolo di chi amministrava una rete capace di raggiungere decine di migliaia di persone, nel momento scelto per attivarla, nella gestione dei messaggi altrui e nella vicinanza di un’altra giornata di piazza. Ridurre questa capacità organizzativa alla sola lettera dei post ha prodotto una decisione formalmente motivata, ma priva della cautela che il contesto richiedeva.</w:t>
       </w:r>
     </w:p>
     <w:p>
@@ -186,7 +186,7 @@
           <w:color w:val="000000"/>
           <w:sz w:val="32"/>
         </w:rPr>
-        <w:t>Un adulto con capacità organizzative</w:t>
+        <w:t>Il tempo che la decisione ha tolto agli accertamenti</w:t>
       </w:r>
     </w:p>
     <w:p>
@@ -199,7 +199,7 @@
           <w:color w:val="000000"/>
           <w:sz w:val="22"/>
         </w:rPr>
-        <w:t>Youssef Siher ha trent’anni. Le cronache lo descrivono come ricercatore di geopolitica, studioso dei movimenti politici islamici e giornalista freelance. Non emerge il profilo di un adolescente trascinato occasionalmente dalla piazza, ma quello di un adulto capace di costruire e amministrare strumenti di comunicazione con migliaia di destinatari.</w:t>
+        <w:t>Siher è stato fermato nella notte tra il 24 e il 25 ottobre. Il 28 ottobre è tornato libero. Telefono e computer sequestrati contenevano un insieme di contatti, conversazioni, accessi e attività che non poteva essere ricostruito in poche ore. Il 31 ottobre la Procura risultava ancora in attesa di ciò che gli accertamenti digitali avrebbero potuto aggiungere. Il materiale non era un dettaglio successivo: era il luogo in cui verificare la reale estensione del ruolo organizzativo contestato.</w:t>
       </w:r>
     </w:p>
     <w:p>
@@ -212,7 +212,7 @@
           <w:color w:val="000000"/>
           <w:sz w:val="22"/>
         </w:rPr>
-        <w:t>Secondo il Corriere della Sera, il canale Telegram del Movimento 17 ottobre aveva circa 11.000 iscritti e la pagina Instagram circa 39.000. I canali sarebbero stati creati la sera del 18 ottobre, dopo le devastazioni del 17 e 18 ottobre a Milano. La loro nascita successiva impedisce di attribuire automaticamente a Siher l’organizzazione di quelle violenze, ma rende evidente la rapidità con cui seppe inserirsi nella mobilitazione e trasformarla in una rete digitale ampia.</w:t>
+        <w:t>La giudice non poteva prorogare il fermo per attendere gli esiti tecnici. Poteva però riconoscere, se li avesse ritenuti presenti, i gravi indizi e le esigenze cautelari previsti dagli articoli 273 e 274 del Codice di procedura penale, applicare una misura coercitiva ai sensi dell’articolo 391 e revocarla o sostituirla quando il quadro fosse cambiato, come prevede l’articolo 299. La legge non offriva tempo in astratto. Offriva strumenti temporanei per governare un rischio concreto.</w:t>
       </w:r>
     </w:p>
     <w:p>
@@ -225,13 +225,14 @@
           <w:color w:val="000000"/>
           <w:sz w:val="22"/>
         </w:rPr>
-        <w:t>Siher si era sposato nel settembre 2026. Il matrimonio, da solo, non dimostra responsabilità o pericolosità. In questa vicenda, però, la dimensione familiare si intreccia direttamente con quella organizzativa: secondo l’Agenzia Nazionale Stampa Associata (ANSA), la moglie era indagata nello stesso procedimento e i due coniugi erano gli amministratori dei canali; nelle aree di pubblicazione riservate agli amministratori sarebbero stati gli unici autorizzati a scrivere. Questo dato non consente di attribuire loro ogni commento comparso negli spazi di discussione collegati, ma rende ancora meno credibile la rappresentazione di un’attività estemporanea o ingenua.</w:t>
+        <w:t>Il risultato della valutazione di Landoni è stato netto: nessun vincolo. Il 30 ottobre era già fissato lo sciopero generale con cortei studenteschi e mobilitazioni nazionali. A Milano, dopo le violenze del 17 e 18 ottobre, le autorità attendevano migliaia di manifestanti. La nuova giornata si è poi svolta con messaggi di solidarietà a Siher. Questo non dimostra che lui avrebbe commesso altri reati. Dimostra che il momento della decisione non era neutro e che l’eventuale capacità di mobilitazione avrebbe avuto un banco di prova immediato.</w:t>
       </w:r>
     </w:p>
     <w:p>
       <w:pPr>
         <w:pStyle w:val="Heading1"/>
         <w:keepNext/>
+        <w:pageBreakBefore/>
         <w:spacing w:before="280" w:after="100"/>
       </w:pPr>
       <w:r>
@@ -241,535 +242,7 @@
           <w:color w:val="000000"/>
           <w:sz w:val="32"/>
         </w:rPr>
-        <w:t>La sequenza dei fatti</w:t>
-      </w:r>
-    </w:p>
-    <w:tbl>
-      <w:tblPr>
-        <w:tblW w:type="auto" w:w="0"/>
-        <w:tblLayout w:type="fixed"/>
-        <w:tblLook w:firstColumn="1" w:firstRow="1" w:lastColumn="0" w:lastRow="0" w:noHBand="0" w:noVBand="1" w:val="04A0"/>
-        <w:tblBorders>
-          <w:top w:val="single" w:sz="6" w:color="D9D9D9"/>
-          <w:left w:val="single" w:sz="6" w:color="D9D9D9"/>
-          <w:bottom w:val="single" w:sz="6" w:color="D9D9D9"/>
-          <w:right w:val="single" w:sz="6" w:color="D9D9D9"/>
-          <w:insideH w:val="single" w:sz="6" w:color="D9D9D9"/>
-          <w:insideV w:val="single" w:sz="6" w:color="D9D9D9"/>
-        </w:tblBorders>
-      </w:tblPr>
-      <w:tblGrid>
-        <w:gridCol w:w="1800"/>
-        <w:gridCol w:w="8136"/>
-      </w:tblGrid>
-      <w:tr>
-        <w:trPr>
-          <w:tblHeader w:val="true"/>
-        </w:trPr>
-        <w:tc>
-          <w:tcPr>
-            <w:tcW w:type="dxa" w:w="1800"/>
-            <w:shd w:fill="243746"/>
-            <w:tcMar>
-              <w:top w:w="90" w:type="dxa"/>
-              <w:start w:w="110" w:type="dxa"/>
-              <w:bottom w:w="90" w:type="dxa"/>
-              <w:end w:w="110" w:type="dxa"/>
-            </w:tcMar>
-          </w:tcPr>
-          <w:p>
-            <w:r>
-              <w:rPr>
-                <w:rFonts w:ascii="Aptos" w:hAnsi="Aptos"/>
-                <w:b/>
-                <w:color w:val="FFFFFF"/>
-                <w:sz w:val="19"/>
-              </w:rPr>
-              <w:t>Data</w:t>
-            </w:r>
-          </w:p>
-        </w:tc>
-        <w:tc>
-          <w:tcPr>
-            <w:tcW w:type="dxa" w:w="8136"/>
-            <w:shd w:fill="243746"/>
-            <w:tcMar>
-              <w:top w:w="90" w:type="dxa"/>
-              <w:start w:w="110" w:type="dxa"/>
-              <w:bottom w:w="90" w:type="dxa"/>
-              <w:end w:w="110" w:type="dxa"/>
-            </w:tcMar>
-          </w:tcPr>
-          <w:p>
-            <w:r>
-              <w:rPr>
-                <w:rFonts w:ascii="Aptos" w:hAnsi="Aptos"/>
-                <w:b/>
-                <w:color w:val="FFFFFF"/>
-                <w:sz w:val="19"/>
-              </w:rPr>
-              <w:t>Evento</w:t>
-            </w:r>
-          </w:p>
-        </w:tc>
-      </w:tr>
-      <w:tr>
-        <w:tc>
-          <w:tcPr>
-            <w:tcW w:type="dxa" w:w="1800"/>
-            <w:tcMar>
-              <w:top w:w="90" w:type="dxa"/>
-              <w:start w:w="110" w:type="dxa"/>
-              <w:bottom w:w="90" w:type="dxa"/>
-              <w:end w:w="110" w:type="dxa"/>
-            </w:tcMar>
-          </w:tcPr>
-          <w:p>
-            <w:pPr>
-              <w:spacing w:after="0"/>
-            </w:pPr>
-            <w:r>
-              <w:rPr>
-                <w:rFonts w:ascii="Aptos" w:hAnsi="Aptos"/>
-                <w:b/>
-                <w:color w:val="000000"/>
-                <w:sz w:val="18"/>
-              </w:rPr>
-              <w:t>17 e 18 ottobre 2026</w:t>
-            </w:r>
-          </w:p>
-        </w:tc>
-        <w:tc>
-          <w:tcPr>
-            <w:tcW w:type="dxa" w:w="8136"/>
-            <w:tcMar>
-              <w:top w:w="90" w:type="dxa"/>
-              <w:start w:w="110" w:type="dxa"/>
-              <w:bottom w:w="90" w:type="dxa"/>
-              <w:end w:w="110" w:type="dxa"/>
-            </w:tcMar>
-          </w:tcPr>
-          <w:p>
-            <w:pPr>
-              <w:spacing w:after="0"/>
-            </w:pPr>
-            <w:r>
-              <w:rPr>
-                <w:rFonts w:ascii="Aptos" w:hAnsi="Aptos"/>
-                <w:b w:val="0"/>
-                <w:color w:val="000000"/>
-                <w:sz w:val="18"/>
-              </w:rPr>
-              <w:t>A Milano le manifestazioni degenerano in saccheggi, devastazioni e scontri. Il numero degli arresti riportato dalle cronache riguarda i fatti di piazza e non prova una responsabilità di Siher.</w:t>
-            </w:r>
-          </w:p>
-        </w:tc>
-      </w:tr>
-      <w:tr>
-        <w:tc>
-          <w:tcPr>
-            <w:tcW w:type="dxa" w:w="1800"/>
-            <w:shd w:fill="F3F6F8"/>
-            <w:tcMar>
-              <w:top w:w="90" w:type="dxa"/>
-              <w:start w:w="110" w:type="dxa"/>
-              <w:bottom w:w="90" w:type="dxa"/>
-              <w:end w:w="110" w:type="dxa"/>
-            </w:tcMar>
-          </w:tcPr>
-          <w:p>
-            <w:pPr>
-              <w:spacing w:after="0"/>
-            </w:pPr>
-            <w:r>
-              <w:rPr>
-                <w:rFonts w:ascii="Aptos" w:hAnsi="Aptos"/>
-                <w:b/>
-                <w:color w:val="000000"/>
-                <w:sz w:val="18"/>
-              </w:rPr>
-              <w:t>18 ottobre</w:t>
-            </w:r>
-          </w:p>
-        </w:tc>
-        <w:tc>
-          <w:tcPr>
-            <w:tcW w:type="dxa" w:w="8136"/>
-            <w:shd w:fill="F3F6F8"/>
-            <w:tcMar>
-              <w:top w:w="90" w:type="dxa"/>
-              <w:start w:w="110" w:type="dxa"/>
-              <w:bottom w:w="90" w:type="dxa"/>
-              <w:end w:w="110" w:type="dxa"/>
-            </w:tcMar>
-          </w:tcPr>
-          <w:p>
-            <w:pPr>
-              <w:spacing w:after="0"/>
-            </w:pPr>
-            <w:r>
-              <w:rPr>
-                <w:rFonts w:ascii="Aptos" w:hAnsi="Aptos"/>
-                <w:b w:val="0"/>
-                <w:color w:val="000000"/>
-                <w:sz w:val="18"/>
-              </w:rPr>
-              <w:t>Nascono i canali del Movimento 17 ottobre, secondo la ricostruzione del Corriere della Sera.</w:t>
-            </w:r>
-          </w:p>
-        </w:tc>
-      </w:tr>
-      <w:tr>
-        <w:tc>
-          <w:tcPr>
-            <w:tcW w:type="dxa" w:w="1800"/>
-            <w:tcMar>
-              <w:top w:w="90" w:type="dxa"/>
-              <w:start w:w="110" w:type="dxa"/>
-              <w:bottom w:w="90" w:type="dxa"/>
-              <w:end w:w="110" w:type="dxa"/>
-            </w:tcMar>
-          </w:tcPr>
-          <w:p>
-            <w:pPr>
-              <w:spacing w:after="0"/>
-            </w:pPr>
-            <w:r>
-              <w:rPr>
-                <w:rFonts w:ascii="Aptos" w:hAnsi="Aptos"/>
-                <w:b/>
-                <w:color w:val="000000"/>
-                <w:sz w:val="18"/>
-              </w:rPr>
-              <w:t>24 ottobre</w:t>
-            </w:r>
-          </w:p>
-        </w:tc>
-        <w:tc>
-          <w:tcPr>
-            <w:tcW w:type="dxa" w:w="8136"/>
-            <w:tcMar>
-              <w:top w:w="90" w:type="dxa"/>
-              <w:start w:w="110" w:type="dxa"/>
-              <w:bottom w:w="90" w:type="dxa"/>
-              <w:end w:w="110" w:type="dxa"/>
-            </w:tcMar>
-          </w:tcPr>
-          <w:p>
-            <w:pPr>
-              <w:spacing w:after="0"/>
-            </w:pPr>
-            <w:r>
-              <w:rPr>
-                <w:rFonts w:ascii="Aptos" w:hAnsi="Aptos"/>
-                <w:b w:val="0"/>
-                <w:color w:val="000000"/>
-                <w:sz w:val="18"/>
-              </w:rPr>
-              <w:t>Siher viene individuato e portato in Questura. Nella notte tra il 24 e il 25 ottobre la Procura dispone il fermo.</w:t>
-            </w:r>
-          </w:p>
-        </w:tc>
-      </w:tr>
-      <w:tr>
-        <w:tc>
-          <w:tcPr>
-            <w:tcW w:type="dxa" w:w="1800"/>
-            <w:shd w:fill="F3F6F8"/>
-            <w:tcMar>
-              <w:top w:w="90" w:type="dxa"/>
-              <w:start w:w="110" w:type="dxa"/>
-              <w:bottom w:w="90" w:type="dxa"/>
-              <w:end w:w="110" w:type="dxa"/>
-            </w:tcMar>
-          </w:tcPr>
-          <w:p>
-            <w:pPr>
-              <w:spacing w:after="0"/>
-            </w:pPr>
-            <w:r>
-              <w:rPr>
-                <w:rFonts w:ascii="Aptos" w:hAnsi="Aptos"/>
-                <w:b/>
-                <w:color w:val="000000"/>
-                <w:sz w:val="18"/>
-              </w:rPr>
-              <w:t>25 ottobre</w:t>
-            </w:r>
-          </w:p>
-        </w:tc>
-        <w:tc>
-          <w:tcPr>
-            <w:tcW w:type="dxa" w:w="8136"/>
-            <w:shd w:fill="F3F6F8"/>
-            <w:tcMar>
-              <w:top w:w="90" w:type="dxa"/>
-              <w:start w:w="110" w:type="dxa"/>
-              <w:bottom w:w="90" w:type="dxa"/>
-              <w:end w:w="110" w:type="dxa"/>
-            </w:tcMar>
-          </w:tcPr>
-          <w:p>
-            <w:pPr>
-              <w:spacing w:after="0"/>
-            </w:pPr>
-            <w:r>
-              <w:rPr>
-                <w:rFonts w:ascii="Aptos" w:hAnsi="Aptos"/>
-                <w:b w:val="0"/>
-                <w:color w:val="000000"/>
-                <w:sz w:val="18"/>
-              </w:rPr>
-              <w:t>Viene trasferito a San Vittore. L’indagine coinvolge anche la moglie, indicata come coamministratrice.</w:t>
-            </w:r>
-          </w:p>
-        </w:tc>
-      </w:tr>
-      <w:tr>
-        <w:tc>
-          <w:tcPr>
-            <w:tcW w:type="dxa" w:w="1800"/>
-            <w:tcMar>
-              <w:top w:w="90" w:type="dxa"/>
-              <w:start w:w="110" w:type="dxa"/>
-              <w:bottom w:w="90" w:type="dxa"/>
-              <w:end w:w="110" w:type="dxa"/>
-            </w:tcMar>
-          </w:tcPr>
-          <w:p>
-            <w:pPr>
-              <w:spacing w:after="0"/>
-            </w:pPr>
-            <w:r>
-              <w:rPr>
-                <w:rFonts w:ascii="Aptos" w:hAnsi="Aptos"/>
-                <w:b/>
-                <w:color w:val="000000"/>
-                <w:sz w:val="18"/>
-              </w:rPr>
-              <w:t>28 ottobre</w:t>
-            </w:r>
-          </w:p>
-        </w:tc>
-        <w:tc>
-          <w:tcPr>
-            <w:tcW w:type="dxa" w:w="8136"/>
-            <w:tcMar>
-              <w:top w:w="90" w:type="dxa"/>
-              <w:start w:w="110" w:type="dxa"/>
-              <w:bottom w:w="90" w:type="dxa"/>
-              <w:end w:w="110" w:type="dxa"/>
-            </w:tcMar>
-          </w:tcPr>
-          <w:p>
-            <w:pPr>
-              <w:spacing w:after="0"/>
-            </w:pPr>
-            <w:r>
-              <w:rPr>
-                <w:rFonts w:ascii="Aptos" w:hAnsi="Aptos"/>
-                <w:b w:val="0"/>
-                <w:color w:val="000000"/>
-                <w:sz w:val="18"/>
-              </w:rPr>
-              <w:t>Landoni non convalida il fermo, respinge la custodia cautelare e dispone la liberazione.</w:t>
-            </w:r>
-          </w:p>
-        </w:tc>
-      </w:tr>
-      <w:tr>
-        <w:tc>
-          <w:tcPr>
-            <w:tcW w:type="dxa" w:w="1800"/>
-            <w:shd w:fill="F3F6F8"/>
-            <w:tcMar>
-              <w:top w:w="90" w:type="dxa"/>
-              <w:start w:w="110" w:type="dxa"/>
-              <w:bottom w:w="90" w:type="dxa"/>
-              <w:end w:w="110" w:type="dxa"/>
-            </w:tcMar>
-          </w:tcPr>
-          <w:p>
-            <w:pPr>
-              <w:spacing w:after="0"/>
-            </w:pPr>
-            <w:r>
-              <w:rPr>
-                <w:rFonts w:ascii="Aptos" w:hAnsi="Aptos"/>
-                <w:b/>
-                <w:color w:val="000000"/>
-                <w:sz w:val="18"/>
-              </w:rPr>
-              <w:t>29 e 30 ottobre</w:t>
-            </w:r>
-          </w:p>
-        </w:tc>
-        <w:tc>
-          <w:tcPr>
-            <w:tcW w:type="dxa" w:w="8136"/>
-            <w:shd w:fill="F3F6F8"/>
-            <w:tcMar>
-              <w:top w:w="90" w:type="dxa"/>
-              <w:start w:w="110" w:type="dxa"/>
-              <w:bottom w:w="90" w:type="dxa"/>
-              <w:end w:w="110" w:type="dxa"/>
-            </w:tcMar>
-          </w:tcPr>
-          <w:p>
-            <w:pPr>
-              <w:spacing w:after="0"/>
-            </w:pPr>
-            <w:r>
-              <w:rPr>
-                <w:rFonts w:ascii="Aptos" w:hAnsi="Aptos"/>
-                <w:b w:val="0"/>
-                <w:color w:val="000000"/>
-                <w:sz w:val="18"/>
-              </w:rPr>
-              <w:t>Diventano pubbliche ulteriori chat, comprese le frasi contro Giovanni Donzelli. Numerosi consiglieri del Consiglio superiore della magistratura chiedono una pratica a tutela di Landoni e il Tribunale di Milano chiede di valutarne la protezione per le minacce ricevute.</w:t>
-            </w:r>
-          </w:p>
-        </w:tc>
-      </w:tr>
-      <w:tr>
-        <w:tc>
-          <w:tcPr>
-            <w:tcW w:type="dxa" w:w="1800"/>
-            <w:tcMar>
-              <w:top w:w="90" w:type="dxa"/>
-              <w:start w:w="110" w:type="dxa"/>
-              <w:bottom w:w="90" w:type="dxa"/>
-              <w:end w:w="110" w:type="dxa"/>
-            </w:tcMar>
-          </w:tcPr>
-          <w:p>
-            <w:pPr>
-              <w:spacing w:after="0"/>
-            </w:pPr>
-            <w:r>
-              <w:rPr>
-                <w:rFonts w:ascii="Aptos" w:hAnsi="Aptos"/>
-                <w:b/>
-                <w:color w:val="000000"/>
-                <w:sz w:val="18"/>
-              </w:rPr>
-              <w:t>30 ottobre</w:t>
-            </w:r>
-          </w:p>
-        </w:tc>
-        <w:tc>
-          <w:tcPr>
-            <w:tcW w:type="dxa" w:w="8136"/>
-            <w:tcMar>
-              <w:top w:w="90" w:type="dxa"/>
-              <w:start w:w="110" w:type="dxa"/>
-              <w:bottom w:w="90" w:type="dxa"/>
-              <w:end w:w="110" w:type="dxa"/>
-            </w:tcMar>
-          </w:tcPr>
-          <w:p>
-            <w:pPr>
-              <w:spacing w:after="0"/>
-            </w:pPr>
-            <w:r>
-              <w:rPr>
-                <w:rFonts w:ascii="Aptos" w:hAnsi="Aptos"/>
-                <w:b w:val="0"/>
-                <w:color w:val="000000"/>
-                <w:sz w:val="18"/>
-              </w:rPr>
-              <w:t>Si svolge lo sciopero generale con cortei di studenti e lavoratori. A Milano partecipano migliaia di persone; nei cortei compaiono anche messaggi di solidarietà a Siher.</w:t>
-            </w:r>
-          </w:p>
-        </w:tc>
-      </w:tr>
-      <w:tr>
-        <w:tc>
-          <w:tcPr>
-            <w:tcW w:type="dxa" w:w="1800"/>
-            <w:shd w:fill="F3F6F8"/>
-            <w:tcMar>
-              <w:top w:w="90" w:type="dxa"/>
-              <w:start w:w="110" w:type="dxa"/>
-              <w:bottom w:w="90" w:type="dxa"/>
-              <w:end w:w="110" w:type="dxa"/>
-            </w:tcMar>
-          </w:tcPr>
-          <w:p>
-            <w:pPr>
-              <w:spacing w:after="0"/>
-            </w:pPr>
-            <w:r>
-              <w:rPr>
-                <w:rFonts w:ascii="Aptos" w:hAnsi="Aptos"/>
-                <w:b/>
-                <w:color w:val="000000"/>
-                <w:sz w:val="18"/>
-              </w:rPr>
-              <w:t>31 ottobre</w:t>
-            </w:r>
-          </w:p>
-        </w:tc>
-        <w:tc>
-          <w:tcPr>
-            <w:tcW w:type="dxa" w:w="8136"/>
-            <w:shd w:fill="F3F6F8"/>
-            <w:tcMar>
-              <w:top w:w="90" w:type="dxa"/>
-              <w:start w:w="110" w:type="dxa"/>
-              <w:bottom w:w="90" w:type="dxa"/>
-              <w:end w:w="110" w:type="dxa"/>
-            </w:tcMar>
-          </w:tcPr>
-          <w:p>
-            <w:pPr>
-              <w:spacing w:after="0"/>
-            </w:pPr>
-            <w:r>
-              <w:rPr>
-                <w:rFonts w:ascii="Aptos" w:hAnsi="Aptos"/>
-                <w:b w:val="0"/>
-                <w:color w:val="000000"/>
-                <w:sz w:val="18"/>
-              </w:rPr>
-              <w:t>Il Corriere della Sera riferisce che la Procura valuta con prudenza l’impugnazione e potrebbe attendere nuovi elementi dagli accertamenti digitali.</w:t>
-            </w:r>
-          </w:p>
-        </w:tc>
-      </w:tr>
-    </w:tbl>
-    <w:p>
-      <w:pPr>
-        <w:spacing w:after="0"/>
-      </w:pPr>
-    </w:p>
-    <w:p>
-      <w:pPr>
-        <w:pStyle w:val="Heading1"/>
-        <w:keepNext/>
-        <w:spacing w:before="280" w:after="100"/>
-      </w:pPr>
-      <w:r>
-        <w:rPr>
-          <w:rFonts w:ascii="Aptos Display" w:hAnsi="Aptos Display"/>
-          <w:b/>
-          <w:color w:val="000000"/>
-          <w:sz w:val="32"/>
-        </w:rPr>
-        <w:t>Come Landoni ha letto i messaggi</w:t>
-      </w:r>
-    </w:p>
-    <w:p>
-      <w:pPr>
-        <w:keepLines w:val="0"/>
-      </w:pPr>
-      <w:r>
-        <w:rPr>
-          <w:rFonts w:ascii="Aptos" w:hAnsi="Aptos"/>
-          <w:color w:val="000000"/>
-          <w:sz w:val="22"/>
-        </w:rPr>
-        <w:t>Il provvedimento ha separato le parole direttamente attribuite a Siher dalle violenze già avvenute. Secondo i passaggi pubblicati da più testate, nei post e nel comunicato l’indagato non avrebbe mai prospettato il ricorso ad azioni violente né indicato le devastazioni del 17 e 18 ottobre come modello della mobilitazione successiva. La giudice ha inoltre escluso un concreto pericolo di fuga.</w:t>
+        <w:t>L’errore di prospettiva</w:t>
       </w:r>
     </w:p>
     <w:p>
@@ -796,7 +269,7 @@
           <w:sz w:val="19"/>
         </w:rPr>
         <w:br/>
-        <w:t>Passaggio dell’ordinanza riportato da Sky TG24, RaiNews e altre testate</w:t>
+        <w:t>Passaggio dell’ordinanza riportato da Sky TG24 e RaiNews</w:t>
       </w:r>
     </w:p>
     <w:p>
@@ -809,7 +282,7 @@
           <w:color w:val="000000"/>
           <w:sz w:val="22"/>
         </w:rPr>
-        <w:t>Questa lettura si concentra sull’autore materiale delle parole e sul loro significato letterale. La domanda editoriale è se un amministratore di canali creati per mobilitare migliaia di persone possa essere valutato soltanto cercando un ordine esplicito firmato da lui. Un’infrastruttura digitale può orientare tempi, luoghi, obiettivi e clima della protesta anche senza formulare direttamente un comando violento. La responsabilità penale resta individuale; la valutazione cautelare, però, riguarda anche il pericolo concreto che un ruolo organizzativo possa produrre.</w:t>
+        <w:t>È il punto centrale del ragionamento della giudice: nei contenuti direttamente attribuiti a Siher non compare l’incitamento esplicito alla violenza e le devastazioni del 17 e 18 ottobre non vengono indicate come modello da ripetere. È un elemento favorevole all’indagato, ma non esaurisce il problema cautelare.</w:t>
       </w:r>
     </w:p>
     <w:p>
@@ -822,7 +295,20 @@
           <w:color w:val="000000"/>
           <w:sz w:val="22"/>
         </w:rPr>
-        <w:t>Il silenzio dell’amministratore davanti a un messaggio violento non equivale automaticamente ad adesione. Occorre conoscere chi poteva cancellare, quali contenuti furono rimossi, quanto rimasero visibili, quali reazioni ricevettero e se Siher intervenne. Proprio perché questi dati richiedevano un esame tecnico, la rapidità con cui è stata esclusa ogni cautela diventa la questione decisiva.</w:t>
+        <w:t>Chi governa uno spazio digitale può esercitare influenza senza scrivere l’ultima frase della catena. Decide quando aprire un canale, quali appuntamenti rilanciare, quali contenuti mettere in evidenza, chi può pubblicare e quali messaggi lasciare visibili. Questa non è una presunzione di colpevolezza. È la ragione per cui il ruolo di amministratore deve essere ricostruito prima di concludere che l’assenza di un ordine personale equivalga all’assenza di rischio.</w:t>
+      </w:r>
+    </w:p>
+    <w:p>
+      <w:pPr>
+        <w:keepLines w:val="0"/>
+      </w:pPr>
+      <w:r>
+        <w:rPr>
+          <w:rFonts w:ascii="Aptos" w:hAnsi="Aptos"/>
+          <w:color w:val="000000"/>
+          <w:sz w:val="22"/>
+        </w:rPr>
+        <w:t>Il silenzio davanti a un messaggio violento non prova automaticamente adesione. Può essere disattenzione, impossibilità materiale di intervenire oppure una scelta. Per distinguerle servono orari, permessi, cancellazioni, reazioni, log e conversazioni. Erano proprio gli elementi ancora in corso di esame quando ogni cautela è stata esclusa. La decisione ha trattato come rassicurante ciò che, in quel momento, era ancora incompleto.</w:t>
       </w:r>
     </w:p>
     <w:p>
@@ -838,7 +324,7 @@
           <w:color w:val="000000"/>
           <w:sz w:val="32"/>
         </w:rPr>
-        <w:t>Nessuna misura mentre gli accertamenti continuavano</w:t>
+        <w:t>Siher non era un ragazzo trascinato dalla piazza</w:t>
       </w:r>
     </w:p>
     <w:p>
@@ -851,7 +337,7 @@
           <w:color w:val="000000"/>
           <w:sz w:val="22"/>
         </w:rPr>
-        <w:t>La convalida del fermo e l’applicazione di una misura cautelare sono decisioni distinte. L’articolo 391 del Codice di procedura penale prevede che, quando sussistono le condizioni dell’articolo 273 e una delle esigenze indicate dall’articolo 274, il giudice possa applicare una misura coercitiva. L’articolo 299 impone poi di revocarla o sostituirla quando quelle condizioni vengono meno o si attenuano.</w:t>
+        <w:t>Youssef Siher aveva trent’anni. Era presentato come ricercatore di geopolitica, studioso dei movimenti politici islamici e giornalista freelance. Il canale Telegram del Movimento 17 ottobre contava circa 11.000 iscritti e la pagina Instagram circa 39.000. I canali sarebbero stati creati la sera del 18 ottobre, dopo le devastazioni milanesi. Questa cronologia non gli attribuisce automaticamente l’organizzazione degli scontri precedenti. Mostra però la rapidità con cui seppe dare una struttura e un pubblico a una mobilitazione già accesa.</w:t>
       </w:r>
     </w:p>
     <w:p>
@@ -864,7 +350,7 @@
           <w:color w:val="000000"/>
           <w:sz w:val="22"/>
         </w:rPr>
-        <w:t>La legge non permette di trattenere una persona soltanto per concedere più tempo agli investigatori. Permette però una misura temporanea e revocabile quando il giudice riconosce gravi indizi e concrete esigenze cautelari. Gli strumenti, dunque, esistevano. Landoni ha ritenuto che ne mancassero i presupposti e non ha applicato alcun vincolo. La critica riguarda precisamente questa valutazione: davvero ruolo, capacità di mobilitazione, contesto e imminenza di un’altra manifestazione non giustificavano nessuna cautela proporzionata?</w:t>
+        <w:t>Il dato anagrafico conta perché impedisce di leggere la vicenda con l’indulgenza riservata a una bravata adolescenziale. Siher era un adulto sposato, con competenze culturali e digitali, capace di costruire un apparato comunicativo in pochi giorni. Il matrimonio non è una patente di rispettabilità né una prova di pericolosità. È un segno di vita adulta e di responsabilità assunte. In questo caso, inoltre, la famiglia non restava fuori dall’attività politica.</w:t>
       </w:r>
     </w:p>
     <w:p>
@@ -877,7 +363,7 @@
           <w:color w:val="000000"/>
           <w:sz w:val="22"/>
         </w:rPr>
-        <w:t>Le fonti pubbliche documentano la richiesta della Procura di applicare la custodia in carcere, respinta dalla GIP. Non consentono di ricostruire integralmente se e come siano state discusse tutte le alternative meno afflittive. Il dato certo resta l’esito: Siher è uscito senza alcuna misura personale.</w:t>
+        <w:t>La moglie, sposata nel settembre 2026, risultava indagata nello stesso procedimento. Secondo l’Agenzia Nazionale Stampa Associata (ANSA), i coniugi erano i due amministratori e, nelle aree riservate alla pubblicazione, gli unici autorizzati a scrivere. Il matrimonio quindi non descrive soltanto una sfera privata da preservare: coincideva anche con una collaborazione nella macchina comunicativa sotto esame. Non sappiamo se quella unione abbia rafforzato l’attivismo. Sappiamo che l’attivismo era condiviso e organizzato dentro la coppia.</w:t>
       </w:r>
     </w:p>
     <w:p>
@@ -949,7 +435,7 @@
           <w:color w:val="000000"/>
           <w:sz w:val="32"/>
         </w:rPr>
-        <w:t>Due giorni prima della nuova piazza nazionale</w:t>
+        <w:t>Il potere di un amministratore digitale</w:t>
       </w:r>
     </w:p>
     <w:p>
@@ -962,7 +448,7 @@
           <w:color w:val="000000"/>
           <w:sz w:val="22"/>
         </w:rPr>
-        <w:t>La liberazione è avvenuta il 28 ottobre. Il 30 ottobre era già previsto lo sciopero generale con mobilitazioni studentesche e cortei nazionali. A Milano le autorità attendevano fino a diecimila manifestanti e mantenevano alta l’attenzione dopo le violenze del fine settimana precedente. La manifestazione si è poi svolta con migliaia di studenti e lavoratori; furono esposti anche messaggi di solidarietà a Siher.</w:t>
+        <w:t>Nel mondo fisico riconosciamo subito la differenza tra chi assiste a una manifestazione e chi prepara il percorso, convoca le persone, distribuisce indicazioni e sceglie gli interlocutori. Online quella differenza è meno visibile, ma non scompare. Un amministratore non è responsabile per definizione di ogni frase scritta da un utente. Possiede però strumenti che un utente comune non ha e può determinare la durata e la diffusione di un contenuto.</w:t>
       </w:r>
     </w:p>
     <w:p>
@@ -975,7 +461,20 @@
           <w:color w:val="000000"/>
           <w:sz w:val="22"/>
         </w:rPr>
-        <w:t>Il calendario non prova che Siher avrebbe commesso nuovi reati. Incide però sulla prudenza richiesta nella valutazione del rischio. La GIP ha escluso ogni misura prima della nuova mobilitazione, mentre il materiale sequestrato poteva ancora chiarire la rete dei contatti, la programmazione delle comunicazioni e la gestione effettiva dei canali. Una cautela temporanea non sarebbe stata una condanna: sarebbe stata una risposta revocabile a un quadro ancora in formazione, se il giudice avesse riconosciuto i presupposti di legge.</w:t>
+        <w:t>Per questo la domanda corretta non era soltanto se Siher avesse scritto parole violente. Bisognava accertare quale controllo esercitasse sugli ambienti collegati, come fossero coordinati Telegram e Instagram, chi autorizzasse i contenuti, quali relazioni esistessero con gli organizzatori delle piazze e se i messaggi più estremi fossero tollerati, contrastati o utilizzati per tenere alta la pressione. Il sequestro dei dispositivi serviva precisamente a dare un contenuto probatorio a queste domande.</w:t>
+      </w:r>
+    </w:p>
+    <w:p>
+      <w:pPr>
+        <w:keepLines w:val="0"/>
+      </w:pPr>
+      <w:r>
+        <w:rPr>
+          <w:rFonts w:ascii="Aptos" w:hAnsi="Aptos"/>
+          <w:color w:val="000000"/>
+          <w:sz w:val="22"/>
+        </w:rPr>
+        <w:t>Landoni ha preferito giudicare subito il nucleo già visibile. È una scelta legittima sul piano delle funzioni, ma discutibile sul piano della prudenza: ha isolato la voce individuale dal sistema che quella voce aveva contribuito a costruire.</w:t>
       </w:r>
     </w:p>
     <w:p>
@@ -991,7 +490,7 @@
           <w:color w:val="000000"/>
           <w:sz w:val="32"/>
         </w:rPr>
-        <w:t>Le chat contro Giovanni Donzelli</w:t>
+        <w:t>Le frasi contro Giovanni Donzelli</w:t>
       </w:r>
     </w:p>
     <w:p>
@@ -1004,7 +503,7 @@
           <w:color w:val="000000"/>
           <w:sz w:val="22"/>
         </w:rPr>
-        <w:t>Il 30 ottobre il Giornale ha pubblicato screenshot attribuiti agli spazi Telegram collegati al Movimento 17 ottobre. Secondo l’articolo, quei messaggi non erano confluiti nella richiesta iniziale di fermo né nel provvedimento di liberazione. Non disponiamo dell’esportazione completa della conversazione e non attribuiamo le due frasi a Siher. Il loro contenuto, però, è esplicito e individua un bersaglio politico per nome.</w:t>
+        <w:t>Dopo la scarcerazione sono stati pubblicati screenshot attribuiti agli spazi Telegram collegati al Movimento 17 ottobre. Non disponiamo dell’esportazione integrale della conversazione e non attribuiamo le frasi a Siher. I messaggi, tuttavia, non lasciano dubbi sul bersaglio evocato.</w:t>
       </w:r>
     </w:p>
     <w:p>
@@ -1051,7 +550,7 @@
           <w:color w:val="000000"/>
           <w:sz w:val="22"/>
         </w:rPr>
-        <w:t>Queste parole superano l’ostilità politica generica. Evocano un’aggressione fisica e richiamano l’attacco subito da Silvio Berlusconi nel 2009. Il punto da accertare non è soltanto chi le abbia scritte: occorre stabilire quando furono pubblicate, chi le vide, quanto rimasero online, chi disponeva dei poteri di moderazione e quali condotte seguirono.</w:t>
+        <w:t>L’immagine della statuetta richiama l’aggressione subita da Silvio Berlusconi nel 2009. Non è dissenso aspro, ma l’evocazione di un atto fisico. Giovanni Donzelli, responsabile dell’organizzazione di Fratelli d’Italia (FdI), riceve minacce da anni. Nel febbraio 2023 il Ministero dell’interno dispose per lui una scorta nel clima del caso Cospito. Nel giugno 2026 a Firenze comparve anche la scritta «Donzelli a testa in giù». Chi scriveva nei canali non stava scegliendo un nome privo di esposizione: indicava una persona il cui rischio era già riconosciuto dallo Stato.</w:t>
       </w:r>
     </w:p>
     <w:p>
@@ -1064,7 +563,7 @@
           <w:color w:val="000000"/>
           <w:sz w:val="22"/>
         </w:rPr>
-        <w:t>Giovanni Donzelli non era un bersaglio casuale né privo di una storia di esposizione. Responsabile dell’organizzazione di Fratelli d’Italia (FdI), proveniente dalla destra universitaria e dal Fronte universitario d’azione nazionale (FUAN), è da tempo oggetto di contestazioni e minacce. Nel febbraio 2023 il Viminale dispose per lui una scorta nel contesto delle tensioni sul caso Cospito. Nel giugno 2026, a Firenze, comparve anche la scritta «Donzelli a testa in giù». Le nuove frasi colpiscono quindi una persona il cui rischio era già stato riconosciuto dallo Stato.</w:t>
+        <w:t>Secondo la ricostruzione pubblicata il 30 ottobre, questi messaggi non erano confluiti nella richiesta iniziale di fermo né nel provvedimento di liberazione. Non possono quindi essere usati retroattivamente come se Landoni li avesse letti e ignorati. Possono però mostrare quanto fosse fragile una valutazione costruita prima di completare l’esame dell’ecosistema digitale. Quando nuovi contenuti emergono subito dopo la liberazione, il dubbio non riguarda soltanto il loro autore. Riguarda la decisione di escludere ogni cautela prima di sapere che cosa contenesse realmente quella rete.</w:t>
       </w:r>
     </w:p>
     <w:p>
@@ -1080,7 +579,7 @@
           <w:color w:val="000000"/>
           <w:sz w:val="32"/>
         </w:rPr>
-        <w:t>Le reazioni politiche rimaste fuori dalla prima sintesi</w:t>
+        <w:t>Il rischio riconosciuto a velocità diverse</w:t>
       </w:r>
     </w:p>
     <w:p>
@@ -1093,7 +592,563 @@
           <w:color w:val="000000"/>
           <w:sz w:val="22"/>
         </w:rPr>
-        <w:t>Il materiale originariamente fornito alla redazione conteneva dichiarazioni politiche complete che l’archivio di lavoro aveva abbreviato. Nel dossier definitivo vengono recuperate perché documentano il modo in cui la vicenda è stata letta da Fratelli d’Italia. Sono dichiarazioni di parte e vanno considerate come tali.</w:t>
+        <w:t>Le minacce contro Landoni sono gravi e devono produrre protezione. Il presidente del Tribunale di Milano Fabio Roia ha chiesto a prefetto e questore di valutare misure a tutela della giudice. Numerosi consiglieri del Consiglio superiore della magistratura (CSM) hanno inoltre chiesto una pratica a tutela dopo le parole con cui la presidente del Consiglio Giorgia Meloni aveva definito «vergognosa» la decisione. Criticare un provvedimento non autorizza nessuno a minacciare chi lo ha firmato.</w:t>
+      </w:r>
+    </w:p>
+    <w:p>
+      <w:pPr>
+        <w:keepLines w:val="0"/>
+      </w:pPr>
+      <w:r>
+        <w:rPr>
+          <w:rFonts w:ascii="Aptos" w:hAnsi="Aptos"/>
+          <w:color w:val="000000"/>
+          <w:sz w:val="22"/>
+        </w:rPr>
+        <w:t>Proprio questa reazione rende visibile un contrasto. Davanti ai messaggi contro la giudice, l’apparato istituzionale ha riconosciuto immediatamente il possibile pericolo: monitoraggio, segnalazioni formali, valutazione della protezione, iniziativa al CSM. Davanti ai messaggi contro Donzelli, già sotto scorta, il materiale è emerso quando Siher era libero e non risultava aver inciso sul primo esame cautelare.</w:t>
+      </w:r>
+    </w:p>
+    <w:p>
+      <w:pPr>
+        <w:keepLines w:val="0"/>
+      </w:pPr>
+      <w:r>
+        <w:rPr>
+          <w:rFonts w:ascii="Aptos" w:hAnsi="Aptos"/>
+          <w:color w:val="000000"/>
+          <w:sz w:val="22"/>
+        </w:rPr>
+        <w:t>Le due situazioni non sono identiche e non chiediamo di sottrarre tutela a Landoni. Chiediamo coerenza nel metodo. Se una minaccia online acquista peso perché il bersaglio è una magistrata esposta, la stessa attenzione deve valere quando il bersaglio è un politico già protetto e quelle parole circolano in un ambiente amministrato da persone sotto indagine. Non basta liquidare il secondo caso come rumore di fondo e il primo come allarme istituzionale.</w:t>
+      </w:r>
+    </w:p>
+    <w:p>
+      <w:pPr>
+        <w:pStyle w:val="Heading1"/>
+        <w:keepNext/>
+        <w:spacing w:before="280" w:after="100"/>
+      </w:pPr>
+      <w:r>
+        <w:rPr>
+          <w:rFonts w:ascii="Aptos Display" w:hAnsi="Aptos Display"/>
+          <w:b/>
+          <w:color w:val="000000"/>
+          <w:sz w:val="32"/>
+        </w:rPr>
+        <w:t>La Procura resa più debole dal primo rigetto</w:t>
+      </w:r>
+    </w:p>
+    <w:p>
+      <w:pPr>
+        <w:keepLines w:val="0"/>
+      </w:pPr>
+      <w:r>
+        <w:rPr>
+          <w:rFonts w:ascii="Aptos" w:hAnsi="Aptos"/>
+          <w:color w:val="000000"/>
+          <w:sz w:val="22"/>
+        </w:rPr>
+        <w:t>La scarcerazione non dimostra che la Procura abbia inventato il caso, né che debba trasformare l’impugnazione in uno scontro con la giudice. Il 31 ottobre l’orientamento sul ricorso veniva descritto come «più no che sì» se gli elementi fossero rimasti gli stessi. La ragione è comprensibile: riproporre un quadro già giudicato insufficiente espone l’accusa a una seconda bocciatura. Telefono e computer possono invece fornire elementi nuovi e rendere più solida una successiva iniziativa.</w:t>
+      </w:r>
+    </w:p>
+    <w:p>
+      <w:pPr>
+        <w:keepLines w:val="0"/>
+      </w:pPr>
+      <w:r>
+        <w:rPr>
+          <w:rFonts w:ascii="Aptos" w:hAnsi="Aptos"/>
+          <w:color w:val="000000"/>
+          <w:sz w:val="22"/>
+        </w:rPr>
+        <w:t>Qui si vede l’effetto concreto dell’ordinanza. Landoni non ha fermato l’indagine, ma ne ha cambiato il terreno. La Procura ora deve scegliere se contestare subito la lettura giuridica o attendere prove capaci di superarla. Nel frattempo Siher resta libero e il controllo sugli eventuali rischi dipende soltanto dalle normali attività investigative. Non è la Procura ad aver scelto questo intervallo senza misura. È la conseguenza della valutazione compiuta dalla GIP.</w:t>
+      </w:r>
+    </w:p>
+    <w:p>
+      <w:pPr>
+        <w:pStyle w:val="Heading1"/>
+        <w:keepNext/>
+        <w:spacing w:before="280" w:after="100"/>
+      </w:pPr>
+      <w:r>
+        <w:rPr>
+          <w:rFonts w:ascii="Aptos Display" w:hAnsi="Aptos Display"/>
+          <w:b/>
+          <w:color w:val="000000"/>
+          <w:sz w:val="32"/>
+        </w:rPr>
+        <w:t>La cautela non sarebbe stata una condanna</w:t>
+      </w:r>
+    </w:p>
+    <w:p>
+      <w:pPr>
+        <w:keepLines w:val="0"/>
+      </w:pPr>
+      <w:r>
+        <w:rPr>
+          <w:rFonts w:ascii="Aptos" w:hAnsi="Aptos"/>
+          <w:color w:val="000000"/>
+          <w:sz w:val="22"/>
+        </w:rPr>
+        <w:t>La libertà personale è la regola e la misura cautelare l’eccezione. Ma eccezione non significa impossibilità. Significa motivazione, proporzionalità, controllo e revoca quando i presupposti cessano. Il sistema conosce diverse misure e non obbliga il giudice a scegliere tra carcere e libertà senza condizioni. Le informazioni pubbliche non permettono di stabilire quale misura alternativa fosse concretamente adeguata al fascicolo. Permettono di constatare che nessuna fu ritenuta necessaria.</w:t>
+      </w:r>
+    </w:p>
+    <w:p>
+      <w:pPr>
+        <w:keepLines w:val="0"/>
+      </w:pPr>
+      <w:r>
+        <w:rPr>
+          <w:rFonts w:ascii="Aptos" w:hAnsi="Aptos"/>
+          <w:color w:val="000000"/>
+          <w:sz w:val="22"/>
+        </w:rPr>
+        <w:t>Una cautela limitata avrebbe potuto accompagnare i pochi giorni necessari a chiarire il materiale digitale e sarebbe stata rimossa se gli accertamenti avessero escluso il rischio. Non avrebbe dichiarato Siher colpevole. Avrebbe riconosciuto che un adulto dotato di capacità organizzative, amministratore con la moglie di canali molto seguiti, non poteva essere valutato come un semplice autore di post isolati mentre un’altra manifestazione nazionale era imminente.</w:t>
+      </w:r>
+    </w:p>
+    <w:p>
+      <w:pPr>
+        <w:keepLines w:val="0"/>
+      </w:pPr>
+      <w:r>
+        <w:rPr>
+          <w:rFonts w:ascii="Aptos" w:hAnsi="Aptos"/>
+          <w:color w:val="000000"/>
+          <w:sz w:val="22"/>
+        </w:rPr>
+        <w:t>La nostra conclusione non riguarda la colpevolezza penale, che deve essere provata nelle forme previste dalla legge. Riguarda il giudizio sul rischio. Landoni ha attribuito valore decisivo all’assenza di un invito personale alla violenza e ha lasciato sullo sfondo la forza dell’organizzazione, i poteri di amministrazione e ciò che i dispositivi non avevano ancora rivelato. In questo scarto si trova la cautela esclusa.</w:t>
+      </w:r>
+    </w:p>
+    <w:p>
+      <w:pPr>
+        <w:pStyle w:val="Heading1"/>
+        <w:keepNext/>
+        <w:spacing w:before="280" w:after="100"/>
+      </w:pPr>
+      <w:r>
+        <w:rPr>
+          <w:rFonts w:ascii="Aptos Display" w:hAnsi="Aptos Display"/>
+          <w:b/>
+          <w:color w:val="000000"/>
+          <w:sz w:val="32"/>
+        </w:rPr>
+        <w:t>I fatti e le deduzioni</w:t>
+      </w:r>
+    </w:p>
+    <w:tbl>
+      <w:tblPr>
+        <w:tblW w:type="dxa" w:w="9648"/>
+        <w:tblLayout w:type="fixed"/>
+        <w:tblLook w:firstColumn="1" w:firstRow="1" w:lastColumn="0" w:lastRow="0" w:noHBand="0" w:noVBand="1" w:val="04A0"/>
+        <w:tblBorders>
+          <w:top w:val="single" w:sz="6" w:color="D9D9D9"/>
+          <w:left w:val="single" w:sz="6" w:color="D9D9D9"/>
+          <w:bottom w:val="single" w:sz="6" w:color="D9D9D9"/>
+          <w:right w:val="single" w:sz="6" w:color="D9D9D9"/>
+          <w:insideH w:val="single" w:sz="6" w:color="D9D9D9"/>
+          <w:insideV w:val="single" w:sz="6" w:color="D9D9D9"/>
+        </w:tblBorders>
+      </w:tblPr>
+      <w:tblGrid>
+        <w:gridCol w:w="2088"/>
+        <w:gridCol w:w="7560"/>
+      </w:tblGrid>
+      <w:tr>
+        <w:trPr>
+          <w:tblHeader w:val="true"/>
+        </w:trPr>
+        <w:tc>
+          <w:tcPr>
+            <w:tcW w:type="dxa" w:w="2088"/>
+            <w:shd w:fill="243746"/>
+            <w:tcMar>
+              <w:top w:w="90" w:type="dxa"/>
+              <w:start w:w="110" w:type="dxa"/>
+              <w:bottom w:w="90" w:type="dxa"/>
+              <w:end w:w="110" w:type="dxa"/>
+            </w:tcMar>
+          </w:tcPr>
+          <w:p>
+            <w:r>
+              <w:rPr>
+                <w:rFonts w:ascii="Aptos" w:hAnsi="Aptos"/>
+                <w:b/>
+                <w:color w:val="FFFFFF"/>
+                <w:sz w:val="19"/>
+              </w:rPr>
+              <w:t>Natura</w:t>
+            </w:r>
+          </w:p>
+        </w:tc>
+        <w:tc>
+          <w:tcPr>
+            <w:tcW w:type="dxa" w:w="7560"/>
+            <w:shd w:fill="243746"/>
+            <w:tcMar>
+              <w:top w:w="90" w:type="dxa"/>
+              <w:start w:w="110" w:type="dxa"/>
+              <w:bottom w:w="90" w:type="dxa"/>
+              <w:end w:w="110" w:type="dxa"/>
+            </w:tcMar>
+          </w:tcPr>
+          <w:p>
+            <w:r>
+              <w:rPr>
+                <w:rFonts w:ascii="Aptos" w:hAnsi="Aptos"/>
+                <w:b/>
+                <w:color w:val="FFFFFF"/>
+                <w:sz w:val="19"/>
+              </w:rPr>
+              <w:t>Punto di osservazione</w:t>
+            </w:r>
+          </w:p>
+        </w:tc>
+      </w:tr>
+      <w:tr>
+        <w:tc>
+          <w:tcPr>
+            <w:tcW w:type="dxa" w:w="2088"/>
+            <w:tcMar>
+              <w:top w:w="90" w:type="dxa"/>
+              <w:start w:w="110" w:type="dxa"/>
+              <w:bottom w:w="90" w:type="dxa"/>
+              <w:end w:w="110" w:type="dxa"/>
+            </w:tcMar>
+          </w:tcPr>
+          <w:p>
+            <w:pPr>
+              <w:spacing w:after="0"/>
+            </w:pPr>
+            <w:r>
+              <w:rPr>
+                <w:rFonts w:ascii="Aptos" w:hAnsi="Aptos"/>
+                <w:b/>
+                <w:color w:val="000000"/>
+                <w:sz w:val="18"/>
+              </w:rPr>
+              <w:t>Fatto documentato</w:t>
+            </w:r>
+          </w:p>
+        </w:tc>
+        <w:tc>
+          <w:tcPr>
+            <w:tcW w:type="dxa" w:w="7560"/>
+            <w:tcMar>
+              <w:top w:w="90" w:type="dxa"/>
+              <w:start w:w="110" w:type="dxa"/>
+              <w:bottom w:w="90" w:type="dxa"/>
+              <w:end w:w="110" w:type="dxa"/>
+            </w:tcMar>
+          </w:tcPr>
+          <w:p>
+            <w:pPr>
+              <w:spacing w:after="0"/>
+            </w:pPr>
+            <w:r>
+              <w:rPr>
+                <w:rFonts w:ascii="Aptos" w:hAnsi="Aptos"/>
+                <w:b w:val="0"/>
+                <w:color w:val="000000"/>
+                <w:sz w:val="18"/>
+              </w:rPr>
+              <w:t>Il 28 ottobre Landoni non ha convalidato il fermo e non ha applicato misure personali.</w:t>
+            </w:r>
+          </w:p>
+        </w:tc>
+      </w:tr>
+      <w:tr>
+        <w:tc>
+          <w:tcPr>
+            <w:tcW w:type="dxa" w:w="2088"/>
+            <w:shd w:fill="F3F6F8"/>
+            <w:tcMar>
+              <w:top w:w="90" w:type="dxa"/>
+              <w:start w:w="110" w:type="dxa"/>
+              <w:bottom w:w="90" w:type="dxa"/>
+              <w:end w:w="110" w:type="dxa"/>
+            </w:tcMar>
+          </w:tcPr>
+          <w:p>
+            <w:pPr>
+              <w:spacing w:after="0"/>
+            </w:pPr>
+            <w:r>
+              <w:rPr>
+                <w:rFonts w:ascii="Aptos" w:hAnsi="Aptos"/>
+                <w:b/>
+                <w:color w:val="000000"/>
+                <w:sz w:val="18"/>
+              </w:rPr>
+              <w:t>Fatto documentato</w:t>
+            </w:r>
+          </w:p>
+        </w:tc>
+        <w:tc>
+          <w:tcPr>
+            <w:tcW w:type="dxa" w:w="7560"/>
+            <w:shd w:fill="F3F6F8"/>
+            <w:tcMar>
+              <w:top w:w="90" w:type="dxa"/>
+              <w:start w:w="110" w:type="dxa"/>
+              <w:bottom w:w="90" w:type="dxa"/>
+              <w:end w:w="110" w:type="dxa"/>
+            </w:tcMar>
+          </w:tcPr>
+          <w:p>
+            <w:pPr>
+              <w:spacing w:after="0"/>
+            </w:pPr>
+            <w:r>
+              <w:rPr>
+                <w:rFonts w:ascii="Aptos" w:hAnsi="Aptos"/>
+                <w:b w:val="0"/>
+                <w:color w:val="000000"/>
+                <w:sz w:val="18"/>
+              </w:rPr>
+              <w:t>Gli accertamenti sui dispositivi erano ancora rilevanti per le successive scelte della Procura.</w:t>
+            </w:r>
+          </w:p>
+        </w:tc>
+      </w:tr>
+      <w:tr>
+        <w:tc>
+          <w:tcPr>
+            <w:tcW w:type="dxa" w:w="2088"/>
+            <w:tcMar>
+              <w:top w:w="90" w:type="dxa"/>
+              <w:start w:w="110" w:type="dxa"/>
+              <w:bottom w:w="90" w:type="dxa"/>
+              <w:end w:w="110" w:type="dxa"/>
+            </w:tcMar>
+          </w:tcPr>
+          <w:p>
+            <w:pPr>
+              <w:spacing w:after="0"/>
+            </w:pPr>
+            <w:r>
+              <w:rPr>
+                <w:rFonts w:ascii="Aptos" w:hAnsi="Aptos"/>
+                <w:b/>
+                <w:color w:val="000000"/>
+                <w:sz w:val="18"/>
+              </w:rPr>
+              <w:t>Fatto documentato</w:t>
+            </w:r>
+          </w:p>
+        </w:tc>
+        <w:tc>
+          <w:tcPr>
+            <w:tcW w:type="dxa" w:w="7560"/>
+            <w:tcMar>
+              <w:top w:w="90" w:type="dxa"/>
+              <w:start w:w="110" w:type="dxa"/>
+              <w:bottom w:w="90" w:type="dxa"/>
+              <w:end w:w="110" w:type="dxa"/>
+            </w:tcMar>
+          </w:tcPr>
+          <w:p>
+            <w:pPr>
+              <w:spacing w:after="0"/>
+            </w:pPr>
+            <w:r>
+              <w:rPr>
+                <w:rFonts w:ascii="Aptos" w:hAnsi="Aptos"/>
+                <w:b w:val="0"/>
+                <w:color w:val="000000"/>
+                <w:sz w:val="18"/>
+              </w:rPr>
+              <w:t>Siher e la moglie risultavano amministratori dei canali, con un pubblico di decine di migliaia di utenti.</w:t>
+            </w:r>
+          </w:p>
+        </w:tc>
+      </w:tr>
+      <w:tr>
+        <w:tc>
+          <w:tcPr>
+            <w:tcW w:type="dxa" w:w="2088"/>
+            <w:shd w:fill="F3F6F8"/>
+            <w:tcMar>
+              <w:top w:w="90" w:type="dxa"/>
+              <w:start w:w="110" w:type="dxa"/>
+              <w:bottom w:w="90" w:type="dxa"/>
+              <w:end w:w="110" w:type="dxa"/>
+            </w:tcMar>
+          </w:tcPr>
+          <w:p>
+            <w:pPr>
+              <w:spacing w:after="0"/>
+            </w:pPr>
+            <w:r>
+              <w:rPr>
+                <w:rFonts w:ascii="Aptos" w:hAnsi="Aptos"/>
+                <w:b/>
+                <w:color w:val="000000"/>
+                <w:sz w:val="18"/>
+              </w:rPr>
+              <w:t>Fatto documentato</w:t>
+            </w:r>
+          </w:p>
+        </w:tc>
+        <w:tc>
+          <w:tcPr>
+            <w:tcW w:type="dxa" w:w="7560"/>
+            <w:shd w:fill="F3F6F8"/>
+            <w:tcMar>
+              <w:top w:w="90" w:type="dxa"/>
+              <w:start w:w="110" w:type="dxa"/>
+              <w:bottom w:w="90" w:type="dxa"/>
+              <w:end w:w="110" w:type="dxa"/>
+            </w:tcMar>
+          </w:tcPr>
+          <w:p>
+            <w:pPr>
+              <w:spacing w:after="0"/>
+            </w:pPr>
+            <w:r>
+              <w:rPr>
+                <w:rFonts w:ascii="Aptos" w:hAnsi="Aptos"/>
+                <w:b w:val="0"/>
+                <w:color w:val="000000"/>
+                <w:sz w:val="18"/>
+              </w:rPr>
+              <w:t>La liberazione è avvenuta due giorni prima della mobilitazione nazionale del 30 ottobre.</w:t>
+            </w:r>
+          </w:p>
+        </w:tc>
+      </w:tr>
+      <w:tr>
+        <w:tc>
+          <w:tcPr>
+            <w:tcW w:type="dxa" w:w="2088"/>
+            <w:tcMar>
+              <w:top w:w="90" w:type="dxa"/>
+              <w:start w:w="110" w:type="dxa"/>
+              <w:bottom w:w="90" w:type="dxa"/>
+              <w:end w:w="110" w:type="dxa"/>
+            </w:tcMar>
+          </w:tcPr>
+          <w:p>
+            <w:pPr>
+              <w:spacing w:after="0"/>
+            </w:pPr>
+            <w:r>
+              <w:rPr>
+                <w:rFonts w:ascii="Aptos" w:hAnsi="Aptos"/>
+                <w:b/>
+                <w:color w:val="000000"/>
+                <w:sz w:val="18"/>
+              </w:rPr>
+              <w:t>Deduzione editoriale</w:t>
+            </w:r>
+          </w:p>
+        </w:tc>
+        <w:tc>
+          <w:tcPr>
+            <w:tcW w:type="dxa" w:w="7560"/>
+            <w:tcMar>
+              <w:top w:w="90" w:type="dxa"/>
+              <w:start w:w="110" w:type="dxa"/>
+              <w:bottom w:w="90" w:type="dxa"/>
+              <w:end w:w="110" w:type="dxa"/>
+            </w:tcMar>
+          </w:tcPr>
+          <w:p>
+            <w:pPr>
+              <w:spacing w:after="0"/>
+            </w:pPr>
+            <w:r>
+              <w:rPr>
+                <w:rFonts w:ascii="Aptos" w:hAnsi="Aptos"/>
+                <w:b w:val="0"/>
+                <w:color w:val="000000"/>
+                <w:sz w:val="18"/>
+              </w:rPr>
+              <w:t>Il ruolo organizzativo non poteva essere valutato soltanto attraverso le frasi personalmente firmate da Siher.</w:t>
+            </w:r>
+          </w:p>
+        </w:tc>
+      </w:tr>
+      <w:tr>
+        <w:tc>
+          <w:tcPr>
+            <w:tcW w:type="dxa" w:w="2088"/>
+            <w:shd w:fill="F3F6F8"/>
+            <w:tcMar>
+              <w:top w:w="90" w:type="dxa"/>
+              <w:start w:w="110" w:type="dxa"/>
+              <w:bottom w:w="90" w:type="dxa"/>
+              <w:end w:w="110" w:type="dxa"/>
+            </w:tcMar>
+          </w:tcPr>
+          <w:p>
+            <w:pPr>
+              <w:spacing w:after="0"/>
+            </w:pPr>
+            <w:r>
+              <w:rPr>
+                <w:rFonts w:ascii="Aptos" w:hAnsi="Aptos"/>
+                <w:b/>
+                <w:color w:val="000000"/>
+                <w:sz w:val="18"/>
+              </w:rPr>
+              <w:t>Scenario possibile</w:t>
+            </w:r>
+          </w:p>
+        </w:tc>
+        <w:tc>
+          <w:tcPr>
+            <w:tcW w:type="dxa" w:w="7560"/>
+            <w:shd w:fill="F3F6F8"/>
+            <w:tcMar>
+              <w:top w:w="90" w:type="dxa"/>
+              <w:start w:w="110" w:type="dxa"/>
+              <w:bottom w:w="90" w:type="dxa"/>
+              <w:end w:w="110" w:type="dxa"/>
+            </w:tcMar>
+          </w:tcPr>
+          <w:p>
+            <w:pPr>
+              <w:spacing w:after="0"/>
+            </w:pPr>
+            <w:r>
+              <w:rPr>
+                <w:rFonts w:ascii="Aptos" w:hAnsi="Aptos"/>
+                <w:b w:val="0"/>
+                <w:color w:val="000000"/>
+                <w:sz w:val="18"/>
+              </w:rPr>
+              <w:t>Una misura proporzionata e revocabile avrebbe potuto coprire la fase di verifica senza anticipare una condanna.</w:t>
+            </w:r>
+          </w:p>
+        </w:tc>
+      </w:tr>
+    </w:tbl>
+    <w:p>
+      <w:pPr>
+        <w:pStyle w:val="Heading1"/>
+        <w:keepNext/>
+        <w:spacing w:before="280" w:after="100"/>
+      </w:pPr>
+      <w:r>
+        <w:rPr>
+          <w:rFonts w:ascii="Aptos Display" w:hAnsi="Aptos Display"/>
+          <w:b/>
+          <w:color w:val="000000"/>
+          <w:sz w:val="32"/>
+        </w:rPr>
+        <w:t>Dichiarazioni politiche</w:t>
+      </w:r>
+    </w:p>
+    <w:p>
+      <w:pPr>
+        <w:keepLines w:val="0"/>
+      </w:pPr>
+      <w:r>
+        <w:rPr>
+          <w:rFonts w:ascii="Aptos" w:hAnsi="Aptos"/>
+          <w:color w:val="000000"/>
+          <w:sz w:val="22"/>
+        </w:rPr>
+        <w:t>Le dichiarazioni riportate di seguito documentano la reazione di Fratelli d’Italia alle frasi contro Donzelli. Sono posizioni politiche, non accertamenti giudiziari.</w:t>
       </w:r>
     </w:p>
     <w:p>
@@ -1120,7 +1175,7 @@
           <w:sz w:val="19"/>
         </w:rPr>
         <w:br/>
-        <w:t>Galeazzo Bignami, dichiarazione riportata nel materiale fornito alla redazione</w:t>
+        <w:t>Galeazzo Bignami</w:t>
       </w:r>
     </w:p>
     <w:p>
@@ -1147,7 +1202,7 @@
           <w:sz w:val="19"/>
         </w:rPr>
         <w:br/>
-        <w:t>Francesco Torselli, europarlamentare di Fratelli d’Italia</w:t>
+        <w:t>Francesco Torselli</w:t>
       </w:r>
     </w:p>
     <w:p>
@@ -1201,272 +1256,7 @@
           <w:sz w:val="19"/>
         </w:rPr>
         <w:br/>
-        <w:t>Parlamentari toscani di Fratelli d’Italia, dichiarazione collettiva</w:t>
-      </w:r>
-    </w:p>
-    <w:p>
-      <w:pPr>
-        <w:pStyle w:val="Heading1"/>
-        <w:keepNext/>
-        <w:spacing w:before="280" w:after="100"/>
-      </w:pPr>
-      <w:r>
-        <w:rPr>
-          <w:rFonts w:ascii="Aptos Display" w:hAnsi="Aptos Display"/>
-          <w:b/>
-          <w:color w:val="000000"/>
-          <w:sz w:val="32"/>
-        </w:rPr>
-        <w:t>La protezione di Landoni e la reazione delle istituzioni</w:t>
-      </w:r>
-    </w:p>
-    <w:p>
-      <w:pPr>
-        <w:keepLines w:val="0"/>
-      </w:pPr>
-      <w:r>
-        <w:rPr>
-          <w:rFonts w:ascii="Aptos" w:hAnsi="Aptos"/>
-          <w:color w:val="000000"/>
-          <w:sz w:val="22"/>
-        </w:rPr>
-        <w:t>Le minacce contro Landoni sono inaccettabili e devono essere valutate senza esitazioni. Il 29 ottobre i vertici del Tribunale di Milano hanno iniziato a monitorare i social. Il giorno successivo il presidente del Tribunale Fabio Roia ha scritto al prefetto e al questore, oltre che ai vertici della Procura, chiedendo di verificare se fossero necessarie misure di protezione. L’ANSA ha riferito che almeno due messaggi allegati alla lettera contenevano minacce esplicite.</w:t>
-      </w:r>
-    </w:p>
-    <w:p>
-      <w:pPr>
-        <w:keepLines w:val="0"/>
-      </w:pPr>
-      <w:r>
-        <w:rPr>
-          <w:rFonts w:ascii="Aptos" w:hAnsi="Aptos"/>
-          <w:color w:val="000000"/>
-          <w:sz w:val="22"/>
-        </w:rPr>
-        <w:t>Parallelamente, numerosi consiglieri del Consiglio superiore della magistratura (CSM) hanno chiesto l’apertura di una pratica a tutela della GIP dopo le dichiarazioni della presidente del Consiglio Giorgia Meloni, che aveva definito la decisione «vergognosa». La richiesta ha sostenuto che una decisione giudiziaria può essere criticata anche severamente, ma non deve essere presentata come ostacolo alla sicurezza o mortificazione delle forze dell’ordine.</w:t>
-      </w:r>
-    </w:p>
-    <w:p>
-      <w:pPr>
-        <w:keepLines w:val="0"/>
-      </w:pPr>
-      <w:r>
-        <w:rPr>
-          <w:rFonts w:ascii="Aptos" w:hAnsi="Aptos"/>
-          <w:color w:val="000000"/>
-          <w:sz w:val="22"/>
-        </w:rPr>
-        <w:t>La tutela della magistrata non è il problema. Il punto è la diversa velocità con cui le istituzioni riconoscono il rischio. Per Landoni, nuove minacce online hanno attivato monitoraggio, lettere formali e un’iniziativa consiliare. Le frasi contro Donzelli, già protetto per minacce pregresse, sono invece emerse dopo la scarcerazione e, secondo la ricostruzione giornalistica, non avevano pesato sul fascicolo iniziale. Il confronto non chiede di ridurre la protezione della giudice: chiede perché il nuovo materiale relativo a un bersaglio già esposto non abbia imposto una rivalutazione altrettanto visibile e tempestiva della posizione di Siher e della gestione dei suoi spazi digitali.</w:t>
-      </w:r>
-    </w:p>
-    <w:p>
-      <w:pPr>
-        <w:pStyle w:val="Heading1"/>
-        <w:keepNext/>
-        <w:spacing w:before="280" w:after="100"/>
-      </w:pPr>
-      <w:r>
-        <w:rPr>
-          <w:rFonts w:ascii="Aptos Display" w:hAnsi="Aptos Display"/>
-          <w:b/>
-          <w:color w:val="000000"/>
-          <w:sz w:val="32"/>
-        </w:rPr>
-        <w:t>La Procura dopo il rigetto</w:t>
-      </w:r>
-    </w:p>
-    <w:p>
-      <w:pPr>
-        <w:keepLines w:val="0"/>
-      </w:pPr>
-      <w:r>
-        <w:rPr>
-          <w:rFonts w:ascii="Aptos" w:hAnsi="Aptos"/>
-          <w:color w:val="000000"/>
-          <w:sz w:val="22"/>
-        </w:rPr>
-        <w:t>Il 31 ottobre il Corriere della Sera ha descritto come «più no che sì» l’orientamento della Procura sul ricorso, qualora il quadro degli elementi fosse rimasto invariato. L’articolo collega la prudenza al rischio di un secondo rigetto e alla possibilità che telefono e computer producano nuovi riscontri. La Procura può proseguire l’indagine a piede libero e contestare la valutazione giuridica già compiuta; non è obbligata a disporre di prove nuove per impugnare ogni profilo, ma nuovi elementi renderebbero più solida l’iniziativa cautelare.</w:t>
-      </w:r>
-    </w:p>
-    <w:p>
-      <w:pPr>
-        <w:keepLines w:val="0"/>
-      </w:pPr>
-      <w:r>
-        <w:rPr>
-          <w:rFonts w:ascii="Aptos" w:hAnsi="Aptos"/>
-          <w:color w:val="000000"/>
-          <w:sz w:val="22"/>
-        </w:rPr>
-        <w:t>Non è una battaglia contro la Procura. È l’effetto strategico della decisione di Landoni. Gli elementi iniziali non sono stati cancellati, ma hanno ricevuto un giudizio negativo nella fase cautelare. Ripresentarli senza un rafforzamento espone l’accusa a una seconda pronuncia sfavorevole. Attendere gli accertamenti digitali può quindi essere la scelta più prudente per l’indagine, ma lascia aperta la domanda sulla prudenza adottata nei giorni immediatamente precedenti alla manifestazione del 30 ottobre.</w:t>
-      </w:r>
-    </w:p>
-    <w:p>
-      <w:pPr>
-        <w:pStyle w:val="Heading1"/>
-        <w:keepNext/>
-        <w:spacing w:before="280" w:after="100"/>
-      </w:pPr>
-      <w:r>
-        <w:rPr>
-          <w:rFonts w:ascii="Aptos Display" w:hAnsi="Aptos Display"/>
-          <w:b/>
-          <w:color w:val="000000"/>
-          <w:sz w:val="32"/>
-        </w:rPr>
-        <w:t>Una decisione formalmente motivata ma poco prudente</w:t>
-      </w:r>
-    </w:p>
-    <w:p>
-      <w:pPr>
-        <w:keepLines w:val="0"/>
-      </w:pPr>
-      <w:r>
-        <w:rPr>
-          <w:rFonts w:ascii="Aptos" w:hAnsi="Aptos"/>
-          <w:color w:val="000000"/>
-          <w:sz w:val="22"/>
-        </w:rPr>
-        <w:t>Landoni ha esercitato il compito che la legge assegna alla GIP: controllare il fermo e impedire che la custodia diventi automatica. La sua ordinanza ha distinto la protesta politica dall’istigazione e ha ritenuto insufficienti gli elementi presentati. Questa è la motivazione giuridica. La valutazione pubblica può però interrogare il perimetro scelto dal provvedimento.</w:t>
-      </w:r>
-    </w:p>
-    <w:p>
-      <w:pPr>
-        <w:keepLines w:val="0"/>
-      </w:pPr>
-      <w:r>
-        <w:rPr>
-          <w:rFonts w:ascii="Aptos" w:hAnsi="Aptos"/>
-          <w:color w:val="000000"/>
-          <w:sz w:val="22"/>
-        </w:rPr>
-        <w:t>Siher era un trentenne con esperienza di ricerca, comunicazione e organizzazione; insieme alla moglie amministrava strumenti capaci di raggiungere decine di migliaia di persone. Le manifestazioni precedenti erano degenerate. Una nuova giornata nazionale era imminente. Il materiale digitale non era esaurito. In quel contesto, l’assenza di un ordine violento scritto personalmente da Siher bastava davvero a escludere ogni pericolo cautelare?</w:t>
-      </w:r>
-    </w:p>
-    <w:p>
-      <w:pPr>
-        <w:keepLines w:val="0"/>
-      </w:pPr>
-      <w:r>
-        <w:rPr>
-          <w:rFonts w:ascii="Aptos" w:hAnsi="Aptos"/>
-          <w:color w:val="000000"/>
-          <w:sz w:val="22"/>
-        </w:rPr>
-        <w:t>Il fermo non è una condanna e una misura cautelare non deve diventare una pena anticipata. Ma anche la libertà senza condizioni è una scelta, non un esito neutro. Fra la custodia cautelare in carcere e l’assenza di qualsiasi vincolo esistono misure graduate, soggette a controllo e revocabili quando i presupposti vengono meno. Le fonti pubbliche non permettono di sapere quali alternative fossero concretamente percorribili nel fascicolo; permettono però di constatare che nessuna fu applicata.</w:t>
-      </w:r>
-    </w:p>
-    <w:p>
-      <w:pPr>
-        <w:keepLines w:val="0"/>
-      </w:pPr>
-      <w:r>
-        <w:rPr>
-          <w:rFonts w:ascii="Aptos" w:hAnsi="Aptos"/>
-          <w:color w:val="000000"/>
-          <w:sz w:val="22"/>
-        </w:rPr>
-        <w:t>La nostra conclusione è editoriale e resta distinta da un accertamento penale: la GIP ha privilegiato una lettura individuale e letterale dei messaggi, sottovalutando il peso organizzativo dell’amministratore, il contesto della rete e il momento in cui decideva. Non ha trattato formalmente Siher come l’autore di una bravata; l’effetto pratico della decisione, tuttavia, è stato quello di escludere qualsiasi cautela davanti a un adulto strutturato e a un quadro ancora incompleto.</w:t>
-      </w:r>
-    </w:p>
-    <w:p>
-      <w:pPr>
-        <w:pStyle w:val="Heading1"/>
-        <w:keepNext/>
-        <w:spacing w:before="280" w:after="100"/>
-      </w:pPr>
-      <w:r>
-        <w:rPr>
-          <w:rFonts w:ascii="Aptos Display" w:hAnsi="Aptos Display"/>
-          <w:b/>
-          <w:color w:val="000000"/>
-          <w:sz w:val="32"/>
-        </w:rPr>
-        <w:t>Le domande che restano</w:t>
-      </w:r>
-    </w:p>
-    <w:p>
-      <w:pPr>
-        <w:pStyle w:val="ListBullet"/>
-        <w:spacing w:after="60"/>
-      </w:pPr>
-      <w:r>
-        <w:rPr>
-          <w:rFonts w:ascii="Aptos" w:hAnsi="Aptos"/>
-          <w:color w:val="000000"/>
-          <w:sz w:val="22"/>
-        </w:rPr>
-        <w:t>Quali messaggi erano effettivamente presenti nella richiesta della Procura e quali sono emersi soltanto dopo la liberazione?</w:t>
-      </w:r>
-    </w:p>
-    <w:p>
-      <w:pPr>
-        <w:pStyle w:val="ListBullet"/>
-        <w:spacing w:after="60"/>
-      </w:pPr>
-      <w:r>
-        <w:rPr>
-          <w:rFonts w:ascii="Aptos" w:hAnsi="Aptos"/>
-          <w:color w:val="000000"/>
-          <w:sz w:val="22"/>
-        </w:rPr>
-        <w:t>Chi scrisse le frasi contro Donzelli, quando furono pubblicate e quali interventi di moderazione seguirono?</w:t>
-      </w:r>
-    </w:p>
-    <w:p>
-      <w:pPr>
-        <w:pStyle w:val="ListBullet"/>
-        <w:spacing w:after="60"/>
-      </w:pPr>
-      <w:r>
-        <w:rPr>
-          <w:rFonts w:ascii="Aptos" w:hAnsi="Aptos"/>
-          <w:color w:val="000000"/>
-          <w:sz w:val="22"/>
-        </w:rPr>
-        <w:t>Quale ruolo ebbero Siher e la moglie nelle aree di pubblicazione, nei gruppi di discussione e nella programmazione delle convocazioni?</w:t>
-      </w:r>
-    </w:p>
-    <w:p>
-      <w:pPr>
-        <w:pStyle w:val="ListBullet"/>
-        <w:spacing w:after="60"/>
-      </w:pPr>
-      <w:r>
-        <w:rPr>
-          <w:rFonts w:ascii="Aptos" w:hAnsi="Aptos"/>
-          <w:color w:val="000000"/>
-          <w:sz w:val="22"/>
-        </w:rPr>
-        <w:t>Perché nessuna misura fu ritenuta proporzionata mentre gli accertamenti informatici erano ancora in corso?</w:t>
-      </w:r>
-    </w:p>
-    <w:p>
-      <w:pPr>
-        <w:pStyle w:val="ListBullet"/>
-        <w:spacing w:after="60"/>
-      </w:pPr>
-      <w:r>
-        <w:rPr>
-          <w:rFonts w:ascii="Aptos" w:hAnsi="Aptos"/>
-          <w:color w:val="000000"/>
-          <w:sz w:val="22"/>
-        </w:rPr>
-        <w:t>La Procura rinuncerà all’impugnazione perché condivide la debolezza del quadro cautelare o perché considera troppo alto il rischio di una seconda bocciatura?</w:t>
-      </w:r>
-    </w:p>
-    <w:p>
-      <w:pPr>
-        <w:pStyle w:val="ListBullet"/>
-        <w:spacing w:after="60"/>
-      </w:pPr>
-      <w:r>
-        <w:rPr>
-          <w:rFonts w:ascii="Aptos" w:hAnsi="Aptos"/>
-          <w:color w:val="000000"/>
-          <w:sz w:val="22"/>
-        </w:rPr>
-        <w:t>I nuovi elementi digitali porteranno a una rivalutazione della posizione di Siher o confermeranno la lettura adottata da Landoni?</w:t>
+        <w:t>Parlamentari toscani di Fratelli d’Italia</w:t>
       </w:r>
     </w:p>
     <w:p>
@@ -1487,8 +1277,9 @@
     </w:p>
     <w:p>
       <w:pPr>
-        <w:pStyle w:val="ListBullet"/>
+        <w:keepLines/>
         <w:spacing w:after="50"/>
+        <w:ind w:left="288" w:hanging="230"/>
       </w:pPr>
       <w:r>
         <w:rPr>
@@ -1496,13 +1287,14 @@
           <w:color w:val="000000"/>
           <w:sz w:val="18"/>
         </w:rPr>
-        <w:t>ANSA, Amministratori chat Movimento 17 ottobre solo Siher e sua moglie, 25 ottobre 2026.</w:t>
+        <w:t>•  ANSA, Amministratori chat Movimento 17 ottobre solo Siher e sua moglie, 25 ottobre 2026.</w:t>
       </w:r>
     </w:p>
     <w:p>
       <w:pPr>
-        <w:pStyle w:val="ListBullet"/>
+        <w:keepLines/>
         <w:spacing w:after="50"/>
+        <w:ind w:left="288" w:hanging="230"/>
       </w:pPr>
       <w:r>
         <w:rPr>
@@ -1510,13 +1302,14 @@
           <w:color w:val="000000"/>
           <w:sz w:val="18"/>
         </w:rPr>
-        <w:t>ANSA, Siher torna in libertà Meloni attacca la gip, 28 ottobre 2026.</w:t>
+        <w:t>•  ANSA, Siher torna in libertà Meloni attacca la gip, 28 ottobre 2026.</w:t>
       </w:r>
     </w:p>
     <w:p>
       <w:pPr>
-        <w:pStyle w:val="ListBullet"/>
+        <w:keepLines/>
         <w:spacing w:after="50"/>
+        <w:ind w:left="288" w:hanging="230"/>
       </w:pPr>
       <w:r>
         <w:rPr>
@@ -1524,13 +1317,14 @@
           <w:color w:val="000000"/>
           <w:sz w:val="18"/>
         </w:rPr>
-        <w:t>ANSA, Il Csm chiede una pratica a tutela della gip del caso Siher, Luca Capponi, 29 ottobre 2026.</w:t>
+        <w:t>•  ANSA, Il Csm chiede una pratica a tutela della gip del caso Siher, Luca Capponi, 29 ottobre 2026.</w:t>
       </w:r>
     </w:p>
     <w:p>
       <w:pPr>
-        <w:pStyle w:val="ListBullet"/>
+        <w:keepLines/>
         <w:spacing w:after="50"/>
+        <w:ind w:left="288" w:hanging="230"/>
       </w:pPr>
       <w:r>
         <w:rPr>
@@ -1538,13 +1332,14 @@
           <w:color w:val="000000"/>
           <w:sz w:val="18"/>
         </w:rPr>
-        <w:t>ANSA, Caso Siher Tribunale chiede di verificare se serve tutela per gip, 30 ottobre 2026.</w:t>
+        <w:t>•  ANSA, Caso Siher Tribunale chiede di verificare se serve tutela per gip, 30 ottobre 2026.</w:t>
       </w:r>
     </w:p>
     <w:p>
       <w:pPr>
-        <w:pStyle w:val="ListBullet"/>
+        <w:keepLines/>
         <w:spacing w:after="50"/>
+        <w:ind w:left="288" w:hanging="230"/>
       </w:pPr>
       <w:r>
         <w:rPr>
@@ -1552,13 +1347,14 @@
           <w:color w:val="000000"/>
           <w:sz w:val="18"/>
         </w:rPr>
-        <w:t>ANSA, A Milano già centinaia in piazza cambia il percorso del corteo degli studenti, 30 ottobre 2026.</w:t>
+        <w:t>•  ANSA, A Milano già centinaia in piazza cambia il percorso del corteo degli studenti, 30 ottobre 2026.</w:t>
       </w:r>
     </w:p>
     <w:p>
       <w:pPr>
-        <w:pStyle w:val="ListBullet"/>
+        <w:keepLines/>
         <w:spacing w:after="50"/>
+        <w:ind w:left="288" w:hanging="230"/>
       </w:pPr>
       <w:r>
         <w:rPr>
@@ -1566,13 +1362,14 @@
           <w:color w:val="000000"/>
           <w:sz w:val="18"/>
         </w:rPr>
-        <w:t>Corriere della Sera Milano, Chi è Youssef Siher la mente dietro il Movimento 17 ottobre, 24 ottobre 2026.</w:t>
+        <w:t>•  Corriere della Sera Milano, Chi è Youssef Siher la mente dietro il Movimento 17 ottobre, 24 ottobre 2026.</w:t>
       </w:r>
     </w:p>
     <w:p>
       <w:pPr>
-        <w:pStyle w:val="ListBullet"/>
+        <w:keepLines/>
         <w:spacing w:after="50"/>
+        <w:ind w:left="288" w:hanging="230"/>
       </w:pPr>
       <w:r>
         <w:rPr>
@@ -1580,13 +1377,14 @@
           <w:color w:val="000000"/>
           <w:sz w:val="18"/>
         </w:rPr>
-        <w:t>Corriere della Sera Milano, Scontri a Milano indagata anche la moglie di Youssef Siher, 25 ottobre 2026.</w:t>
+        <w:t>•  Corriere della Sera Milano, Scontri a Milano indagata anche la moglie di Youssef Siher, 25 ottobre 2026.</w:t>
       </w:r>
     </w:p>
     <w:p>
       <w:pPr>
-        <w:pStyle w:val="ListBullet"/>
+        <w:keepLines/>
         <w:spacing w:after="50"/>
+        <w:ind w:left="288" w:hanging="230"/>
       </w:pPr>
       <w:r>
         <w:rPr>
@@ -1594,13 +1392,14 @@
           <w:color w:val="000000"/>
           <w:sz w:val="18"/>
         </w:rPr>
-        <w:t>Corriere della Sera Milano, Youssef Siher non convalida del fermo il ricorso possibile soltanto con nuovi elementi di indagine, Luigi Ferrarella, 31 ottobre 2026.</w:t>
+        <w:t>•  Corriere della Sera Milano, Youssef Siher non convalida del fermo il ricorso possibile soltanto con nuovi elementi di indagine, Luigi Ferrarella, 31 ottobre 2026.</w:t>
       </w:r>
     </w:p>
     <w:p>
       <w:pPr>
-        <w:pStyle w:val="ListBullet"/>
+        <w:keepLines/>
         <w:spacing w:after="50"/>
+        <w:ind w:left="288" w:hanging="230"/>
       </w:pPr>
       <w:r>
         <w:rPr>
@@ -1608,13 +1407,14 @@
           <w:color w:val="000000"/>
           <w:sz w:val="18"/>
         </w:rPr>
-        <w:t>Sky TG24, Proteste Milano fermato Siher, 25 ottobre 2026.</w:t>
+        <w:t>•  Sky TG24, Proteste Milano fermato Siher, 25 ottobre 2026.</w:t>
       </w:r>
     </w:p>
     <w:p>
       <w:pPr>
-        <w:pStyle w:val="ListBullet"/>
+        <w:keepLines/>
         <w:spacing w:after="50"/>
+        <w:ind w:left="288" w:hanging="230"/>
       </w:pPr>
       <w:r>
         <w:rPr>
@@ -1622,13 +1422,14 @@
           <w:color w:val="000000"/>
           <w:sz w:val="18"/>
         </w:rPr>
-        <w:t>Sky TG24, Youssef Siher il gip di Milano lo rimette in libertà, 28 ottobre 2026.</w:t>
+        <w:t>•  Sky TG24, Youssef Siher il gip di Milano lo rimette in libertà, 28 ottobre 2026.</w:t>
       </w:r>
     </w:p>
     <w:p>
       <w:pPr>
-        <w:pStyle w:val="ListBullet"/>
+        <w:keepLines/>
         <w:spacing w:after="50"/>
+        <w:ind w:left="288" w:hanging="230"/>
       </w:pPr>
       <w:r>
         <w:rPr>
@@ -1636,13 +1437,14 @@
           <w:color w:val="000000"/>
           <w:sz w:val="18"/>
         </w:rPr>
-        <w:t>RaiNews, Youssef Siher è in carcere indagata anche la moglie, 25 ottobre 2026.</w:t>
+        <w:t>•  RaiNews, Youssef Siher è in carcere indagata anche la moglie, 25 ottobre 2026.</w:t>
       </w:r>
     </w:p>
     <w:p>
       <w:pPr>
-        <w:pStyle w:val="ListBullet"/>
+        <w:keepLines/>
         <w:spacing w:after="50"/>
+        <w:ind w:left="288" w:hanging="230"/>
       </w:pPr>
       <w:r>
         <w:rPr>
@@ -1650,13 +1452,14 @@
           <w:color w:val="000000"/>
           <w:sz w:val="18"/>
         </w:rPr>
-        <w:t>RaiNews, Cortei Youssef Siher è libero chiesta in Csm tutela della gip, 29 ottobre 2026.</w:t>
+        <w:t>•  RaiNews, Cortei Youssef Siher è libero chiesta in Csm tutela della gip, 29 ottobre 2026.</w:t>
       </w:r>
     </w:p>
     <w:p>
       <w:pPr>
-        <w:pStyle w:val="ListBullet"/>
+        <w:keepLines/>
         <w:spacing w:after="50"/>
+        <w:ind w:left="288" w:hanging="230"/>
       </w:pPr>
       <w:r>
         <w:rPr>
@@ -1664,13 +1467,14 @@
           <w:color w:val="000000"/>
           <w:sz w:val="18"/>
         </w:rPr>
-        <w:t>RaiNews, Disposta la scorta anche per Donzelli, aggiornamento del 3 febbraio 2023 sul caso Cospito.</w:t>
+        <w:t>•  RaiNews, Disposta la scorta anche per Donzelli, aggiornamento del 3 febbraio 2023 sul caso Cospito.</w:t>
       </w:r>
     </w:p>
     <w:p>
       <w:pPr>
-        <w:pStyle w:val="ListBullet"/>
+        <w:keepLines/>
         <w:spacing w:after="50"/>
+        <w:ind w:left="288" w:hanging="230"/>
       </w:pPr>
       <w:r>
         <w:rPr>
@@ -1678,13 +1482,14 @@
           <w:color w:val="000000"/>
           <w:sz w:val="18"/>
         </w:rPr>
-        <w:t>Il Giornale, Pure Donzelli nel mirino di Siher Ira FdI sulla gip, 30 ottobre 2026.</w:t>
+        <w:t>•  Il Giornale, Pure Donzelli nel mirino di Siher Ira FdI sulla gip, 30 ottobre 2026.</w:t>
       </w:r>
     </w:p>
     <w:p>
       <w:pPr>
-        <w:pStyle w:val="ListBullet"/>
+        <w:keepLines/>
         <w:spacing w:after="50"/>
+        <w:ind w:left="288" w:hanging="230"/>
       </w:pPr>
       <w:r>
         <w:rPr>
@@ -1692,13 +1497,14 @@
           <w:color w:val="000000"/>
           <w:sz w:val="18"/>
         </w:rPr>
-        <w:t>Secolo d’Italia, Spaccate il muso a Donzelli il messaggio choc nelle chat di Siher, 30 ottobre 2026.</w:t>
+        <w:t>•  Secolo d’Italia, Spaccate il muso a Donzelli il messaggio choc nelle chat di Siher, 30 ottobre 2026.</w:t>
       </w:r>
     </w:p>
     <w:p>
       <w:pPr>
-        <w:pStyle w:val="ListBullet"/>
+        <w:keepLines/>
         <w:spacing w:after="50"/>
+        <w:ind w:left="288" w:hanging="230"/>
       </w:pPr>
       <w:r>
         <w:rPr>
@@ -1706,13 +1512,14 @@
           <w:color w:val="000000"/>
           <w:sz w:val="18"/>
         </w:rPr>
-        <w:t>Fratelli d’Italia, Siher con nuove chat si rivaluti posizione Solidarietà a Donzelli per minacce, 29 ottobre 2026.</w:t>
+        <w:t>•  Fratelli d’Italia, Siher con nuove chat si rivaluti posizione Solidarietà a Donzelli per minacce, 29 ottobre 2026.</w:t>
       </w:r>
     </w:p>
     <w:p>
       <w:pPr>
-        <w:pStyle w:val="ListBullet"/>
+        <w:keepLines/>
         <w:spacing w:after="50"/>
+        <w:ind w:left="288" w:hanging="230"/>
       </w:pPr>
       <w:r>
         <w:rPr>
@@ -1720,13 +1527,14 @@
           <w:color w:val="000000"/>
           <w:sz w:val="18"/>
         </w:rPr>
-        <w:t>Normattiva, Codice di procedura penale, articoli 273, 274, 299, 310 e 391, testo vigente consultato il 31 ottobre 2026.</w:t>
+        <w:t>•  Normattiva, Codice di procedura penale, articoli 273, 274, 299, 310 e 391, testo vigente consultato il 31 ottobre 2026.</w:t>
       </w:r>
     </w:p>
     <w:p>
       <w:pPr>
-        <w:pStyle w:val="ListBullet"/>
+        <w:keepLines/>
         <w:spacing w:after="50"/>
+        <w:ind w:left="288" w:hanging="230"/>
       </w:pPr>
       <w:r>
         <w:rPr>
@@ -1734,7 +1542,7 @@
           <w:color w:val="000000"/>
           <w:sz w:val="18"/>
         </w:rPr>
-        <w:t>Normattiva, Codice penale, articolo 414, testo vigente consultato il 31 ottobre 2026.</w:t>
+        <w:t>•  Normattiva, Codice penale, articolo 414, testo vigente consultato il 31 ottobre 2026.</w:t>
       </w:r>
     </w:p>
     <w:sectPr>

</xml_diff>

<commit_message>
Corregge i tempi verbali nel profilo di Siher
</commit_message>
<xml_diff>
--- a/DOSSIER_SIHER_LA_CAUTELA_ESCLUSA.docx
+++ b/DOSSIER_SIHER_LA_CAUTELA_ESCLUSA.docx
@@ -324,7 +324,7 @@
           <w:color w:val="000000"/>
           <w:sz w:val="32"/>
         </w:rPr>
-        <w:t>Siher non era un ragazzo trascinato dalla piazza</w:t>
+        <w:t>Siher non è un ragazzo trascinato dalla piazza</w:t>
       </w:r>
     </w:p>
     <w:p>
@@ -337,7 +337,7 @@
           <w:color w:val="000000"/>
           <w:sz w:val="22"/>
         </w:rPr>
-        <w:t>Youssef Siher aveva trent’anni. Era presentato come ricercatore di geopolitica, studioso dei movimenti politici islamici e giornalista freelance. Il canale Telegram del Movimento 17 ottobre contava circa 11.000 iscritti e la pagina Instagram circa 39.000. I canali sarebbero stati creati la sera del 18 ottobre, dopo le devastazioni milanesi. Questa cronologia non gli attribuisce automaticamente l’organizzazione degli scontri precedenti. Mostra però la rapidità con cui seppe dare una struttura e un pubblico a una mobilitazione già accesa.</w:t>
+        <w:t>Youssef Siher ha trent’anni. È presentato come ricercatore di geopolitica, studioso dei movimenti politici islamici e giornalista freelance. Il canale Telegram del Movimento 17 ottobre contava circa 11.000 iscritti e la pagina Instagram circa 39.000. I canali sarebbero stati creati la sera del 18 ottobre, dopo le devastazioni milanesi. Questa cronologia non gli attribuisce automaticamente l’organizzazione degli scontri precedenti. Mostra però la rapidità con cui ha saputo dare una struttura e un pubblico a una mobilitazione già accesa.</w:t>
       </w:r>
     </w:p>
     <w:p>
@@ -350,7 +350,7 @@
           <w:color w:val="000000"/>
           <w:sz w:val="22"/>
         </w:rPr>
-        <w:t>Il dato anagrafico conta perché impedisce di leggere la vicenda con l’indulgenza riservata a una bravata adolescenziale. Siher era un adulto sposato, con competenze culturali e digitali, capace di costruire un apparato comunicativo in pochi giorni. Il matrimonio non è una patente di rispettabilità né una prova di pericolosità. È un segno di vita adulta e di responsabilità assunte. In questo caso, inoltre, la famiglia non restava fuori dall’attività politica.</w:t>
+        <w:t>Il dato anagrafico conta perché impedisce di leggere la vicenda con l’indulgenza riservata a una bravata adolescenziale. Siher è un adulto sposato, con competenze culturali e digitali, capace di costruire un apparato comunicativo in pochi giorni. Il matrimonio non è una patente di rispettabilità né una prova di pericolosità. È un segno di vita adulta e di responsabilità assunte. In questo caso, inoltre, la famiglia non resta fuori dall’attività politica.</w:t>
       </w:r>
     </w:p>
     <w:p>
@@ -363,7 +363,7 @@
           <w:color w:val="000000"/>
           <w:sz w:val="22"/>
         </w:rPr>
-        <w:t>La moglie, sposata nel settembre 2026, risultava indagata nello stesso procedimento. Secondo l’Agenzia Nazionale Stampa Associata (ANSA), i coniugi erano i due amministratori e, nelle aree riservate alla pubblicazione, gli unici autorizzati a scrivere. Il matrimonio quindi non descrive soltanto una sfera privata da preservare: coincideva anche con una collaborazione nella macchina comunicativa sotto esame. Non sappiamo se quella unione abbia rafforzato l’attivismo. Sappiamo che l’attivismo era condiviso e organizzato dentro la coppia.</w:t>
+        <w:t>La moglie, sposata nel settembre 2026, risulta indagata nello stesso procedimento. Secondo l’Agenzia Nazionale Stampa Associata (ANSA), i coniugi risultano i due amministratori e, nelle aree riservate alla pubblicazione, gli unici autorizzati a scrivere. Il matrimonio quindi non descrive soltanto una sfera privata da preservare: coincide anche con una collaborazione nella macchina comunicativa sotto esame. Non sappiamo se quella unione abbia rafforzato l’attivismo. Sappiamo che l’attivismo è condiviso e organizzato dentro la coppia.</w:t>
       </w:r>
     </w:p>
     <w:p>
@@ -956,7 +956,7 @@
                 <w:color w:val="000000"/>
                 <w:sz w:val="18"/>
               </w:rPr>
-              <w:t>Siher e la moglie risultavano amministratori dei canali, con un pubblico di decine di migliaia di utenti.</w:t>
+              <w:t>Siher e la moglie risultano amministratori dei canali, con un pubblico di decine di migliaia di utenti.</w:t>
             </w:r>
           </w:p>
         </w:tc>

</xml_diff>